<commit_message>
:memo: PX4 和 QGroundControl 调整顺序.
</commit_message>
<xml_diff>
--- a/教学进度表/进度表-低空1班.docx
+++ b/教学进度表/进度表-低空1班.docx
@@ -897,8 +897,6 @@
               </w:rPr>
               <w:t>低空产业1</w:t>
             </w:r>
-            <w:bookmarkStart w:id="1" w:name="_GoBack"/>
-            <w:bookmarkEnd w:id="1"/>
             <w:r>
               <w:rPr>
                 <w:rFonts w:hint="eastAsia" w:ascii="宋体" w:hAnsi="宋体" w:cs="宋体"/>
@@ -2409,105 +2407,91 @@
                 <w:sz w:val="21"/>
                 <w:szCs w:val="21"/>
               </w:rPr>
-              <w:t>第五章：PX4飞控系统架构</w:t>
-            </w:r>
-          </w:p>
-          <w:p>
-            <w:pPr>
-              <w:spacing w:before="60" w:after="60"/>
-              <w:jc w:val="both"/>
-            </w:pPr>
-            <w:r>
-              <w:rPr>
-                <w:rFonts w:ascii="宋体" w:hAnsi="宋体" w:eastAsia="宋体" w:cs="宋体"/>
-                <w:sz w:val="21"/>
-                <w:szCs w:val="21"/>
-              </w:rPr>
-              <w:t>1.从小车到无人机：技术迁移的思考</w:t>
-            </w:r>
-          </w:p>
-          <w:p>
-            <w:pPr>
-              <w:spacing w:before="60" w:after="60"/>
-              <w:jc w:val="both"/>
-            </w:pPr>
-            <w:r>
-              <w:rPr>
-                <w:rFonts w:ascii="宋体" w:hAnsi="宋体" w:eastAsia="宋体" w:cs="宋体"/>
-                <w:sz w:val="21"/>
-                <w:szCs w:val="21"/>
-              </w:rPr>
-              <w:t>2.飞控系统：PX4架构概览（传感器→估计器→控制器→混控器）</w:t>
-            </w:r>
-          </w:p>
-          <w:p>
-            <w:pPr>
-              <w:spacing w:before="60" w:after="60"/>
-              <w:jc w:val="both"/>
-            </w:pPr>
-            <w:r>
-              <w:rPr>
-                <w:rFonts w:ascii="宋体" w:hAnsi="宋体" w:eastAsia="宋体" w:cs="宋体"/>
-                <w:sz w:val="21"/>
-                <w:szCs w:val="21"/>
-              </w:rPr>
-              <w:t>3.软件分工：PX4（飞控/姿态稳定）与ROS2（任务/业务逻辑）</w:t>
-            </w:r>
-          </w:p>
-          <w:p>
-            <w:pPr>
-              <w:spacing w:before="60" w:after="60"/>
-              <w:jc w:val="both"/>
-            </w:pPr>
-            <w:r>
-              <w:rPr>
-                <w:rFonts w:ascii="宋体" w:hAnsi="宋体" w:eastAsia="宋体" w:cs="宋体"/>
-                <w:sz w:val="21"/>
-                <w:szCs w:val="21"/>
-              </w:rPr>
-              <w:t>4.通信桥接：MicroXRCE-DDS中间件原理</w:t>
-            </w:r>
-          </w:p>
-          <w:p>
-            <w:pPr>
-              <w:spacing w:before="60" w:after="60"/>
-              <w:jc w:val="both"/>
-            </w:pPr>
-            <w:r>
-              <w:rPr>
-                <w:rFonts w:ascii="宋体" w:hAnsi="宋体" w:eastAsia="宋体" w:cs="宋体"/>
-                <w:sz w:val="21"/>
-                <w:szCs w:val="21"/>
-              </w:rPr>
-              <w:t>5.编译并启动PX4 SITL仿真（Gazebo Harmonic）</w:t>
-            </w:r>
-          </w:p>
-          <w:p>
-            <w:pPr>
-              <w:spacing w:before="60" w:after="60"/>
-              <w:jc w:val="both"/>
-            </w:pPr>
-            <w:r>
-              <w:rPr>
-                <w:rFonts w:ascii="宋体" w:hAnsi="宋体" w:eastAsia="宋体" w:cs="宋体"/>
-                <w:sz w:val="21"/>
-                <w:szCs w:val="21"/>
-              </w:rPr>
-              <w:t>6.配置MicroXRCE-DDS Agent，桥接PX4与ROS2</w:t>
-            </w:r>
-          </w:p>
-          <w:p>
-            <w:pPr>
-              <w:spacing w:before="60" w:after="60"/>
-              <w:jc w:val="both"/>
-            </w:pPr>
-            <w:r>
-              <w:rPr>
-                <w:rFonts w:ascii="宋体" w:hAnsi="宋体" w:eastAsia="宋体" w:cs="宋体"/>
-                <w:sz w:val="21"/>
-                <w:szCs w:val="21"/>
-              </w:rPr>
-              <w:t>7.使用 ros2 topic list 查看PX4发布的话题</w:t>
+              <w:t>第五章：地面站与任务规划</w:t>
+            </w:r>
+          </w:p>
+          <w:p>
+            <w:pPr>
+              <w:spacing w:before="60" w:after="60"/>
+              <w:jc w:val="both"/>
+            </w:pPr>
+            <w:r>
+              <w:rPr>
+                <w:rFonts w:ascii="宋体" w:hAnsi="宋体" w:eastAsia="宋体" w:cs="宋体"/>
+                <w:sz w:val="21"/>
+                <w:szCs w:val="21"/>
+              </w:rPr>
+              <w:t>1.地面站作用：监控、规划、调参、日志分析</w:t>
+            </w:r>
+          </w:p>
+          <w:p>
+            <w:pPr>
+              <w:spacing w:before="60" w:after="60"/>
+              <w:jc w:val="both"/>
+            </w:pPr>
+            <w:r>
+              <w:rPr>
+                <w:rFonts w:ascii="宋体" w:hAnsi="宋体" w:eastAsia="宋体" w:cs="宋体"/>
+                <w:sz w:val="21"/>
+                <w:szCs w:val="21"/>
+              </w:rPr>
+              <w:t>2.QGroundControl：界面介绍与核心功能</w:t>
+            </w:r>
+          </w:p>
+          <w:p>
+            <w:pPr>
+              <w:spacing w:before="60" w:after="60"/>
+              <w:jc w:val="both"/>
+            </w:pPr>
+            <w:r>
+              <w:rPr>
+                <w:rFonts w:ascii="宋体" w:hAnsi="宋体" w:eastAsia="宋体" w:cs="宋体"/>
+                <w:sz w:val="21"/>
+                <w:szCs w:val="21"/>
+              </w:rPr>
+              <w:t>3.飞行模式：Manual、Position、Offboard等模式解析</w:t>
+            </w:r>
+          </w:p>
+          <w:p>
+            <w:pPr>
+              <w:spacing w:before="60" w:after="60"/>
+              <w:jc w:val="both"/>
+            </w:pPr>
+            <w:r>
+              <w:rPr>
+                <w:rFonts w:ascii="宋体" w:hAnsi="宋体" w:eastAsia="宋体" w:cs="宋体"/>
+                <w:sz w:val="21"/>
+                <w:szCs w:val="21"/>
+              </w:rPr>
+              <w:t>4.安装并连接QGroundControl到PX4 SITL</w:t>
+            </w:r>
+          </w:p>
+          <w:p>
+            <w:pPr>
+              <w:spacing w:before="60" w:after="60"/>
+              <w:jc w:val="both"/>
+            </w:pPr>
+            <w:r>
+              <w:rPr>
+                <w:rFonts w:ascii="宋体" w:hAnsi="宋体" w:eastAsia="宋体" w:cs="宋体"/>
+                <w:sz w:val="21"/>
+                <w:szCs w:val="21"/>
+              </w:rPr>
+              <w:t>5.在地面站中规划航点任务（Waypoint Mission）</w:t>
+            </w:r>
+          </w:p>
+          <w:p>
+            <w:pPr>
+              <w:spacing w:before="60" w:after="60"/>
+              <w:jc w:val="both"/>
+            </w:pPr>
+            <w:r>
+              <w:rPr>
+                <w:rFonts w:ascii="宋体" w:hAnsi="宋体" w:eastAsia="宋体" w:cs="宋体"/>
+                <w:sz w:val="21"/>
+                <w:szCs w:val="21"/>
+              </w:rPr>
+              <w:t>6.执行自动航线飞行，观察飞行状态</w:t>
             </w:r>
           </w:p>
           <w:p>
@@ -2528,7 +2512,7 @@
                 <w:sz w:val="21"/>
                 <w:szCs w:val="21"/>
               </w:rPr>
-              <w:t>8.通过ROS2话题读取无人机位姿、速度等状态信息</w:t>
+              <w:t>7.使用地面站进行参数调整与日志下载</w:t>
             </w:r>
           </w:p>
         </w:tc>
@@ -2700,91 +2684,105 @@
                 <w:sz w:val="21"/>
                 <w:szCs w:val="21"/>
               </w:rPr>
-              <w:t>第六章：地面站与任务规划</w:t>
-            </w:r>
-          </w:p>
-          <w:p>
-            <w:pPr>
-              <w:spacing w:before="60" w:after="60"/>
-              <w:jc w:val="both"/>
-            </w:pPr>
-            <w:r>
-              <w:rPr>
-                <w:rFonts w:ascii="宋体" w:hAnsi="宋体" w:eastAsia="宋体" w:cs="宋体"/>
-                <w:sz w:val="21"/>
-                <w:szCs w:val="21"/>
-              </w:rPr>
-              <w:t>1.地面站作用：监控、规划、调参、日志分析</w:t>
-            </w:r>
-          </w:p>
-          <w:p>
-            <w:pPr>
-              <w:spacing w:before="60" w:after="60"/>
-              <w:jc w:val="both"/>
-            </w:pPr>
-            <w:r>
-              <w:rPr>
-                <w:rFonts w:ascii="宋体" w:hAnsi="宋体" w:eastAsia="宋体" w:cs="宋体"/>
-                <w:sz w:val="21"/>
-                <w:szCs w:val="21"/>
-              </w:rPr>
-              <w:t>2.QGroundControl：界面介绍与核心功能</w:t>
-            </w:r>
-          </w:p>
-          <w:p>
-            <w:pPr>
-              <w:spacing w:before="60" w:after="60"/>
-              <w:jc w:val="both"/>
-            </w:pPr>
-            <w:r>
-              <w:rPr>
-                <w:rFonts w:ascii="宋体" w:hAnsi="宋体" w:eastAsia="宋体" w:cs="宋体"/>
-                <w:sz w:val="21"/>
-                <w:szCs w:val="21"/>
-              </w:rPr>
-              <w:t>3.飞行模式：Manual、Position、Offboard等模式解析</w:t>
-            </w:r>
-          </w:p>
-          <w:p>
-            <w:pPr>
-              <w:spacing w:before="60" w:after="60"/>
-              <w:jc w:val="both"/>
-            </w:pPr>
-            <w:r>
-              <w:rPr>
-                <w:rFonts w:ascii="宋体" w:hAnsi="宋体" w:eastAsia="宋体" w:cs="宋体"/>
-                <w:sz w:val="21"/>
-                <w:szCs w:val="21"/>
-              </w:rPr>
-              <w:t>4.安装并连接QGroundControl到PX4 SITL</w:t>
-            </w:r>
-          </w:p>
-          <w:p>
-            <w:pPr>
-              <w:spacing w:before="60" w:after="60"/>
-              <w:jc w:val="both"/>
-            </w:pPr>
-            <w:r>
-              <w:rPr>
-                <w:rFonts w:ascii="宋体" w:hAnsi="宋体" w:eastAsia="宋体" w:cs="宋体"/>
-                <w:sz w:val="21"/>
-                <w:szCs w:val="21"/>
-              </w:rPr>
-              <w:t>5.在地面站中规划航点任务（Waypoint Mission）</w:t>
-            </w:r>
-          </w:p>
-          <w:p>
-            <w:pPr>
-              <w:spacing w:before="60" w:after="60"/>
-              <w:jc w:val="both"/>
-            </w:pPr>
-            <w:r>
-              <w:rPr>
-                <w:rFonts w:ascii="宋体" w:hAnsi="宋体" w:eastAsia="宋体" w:cs="宋体"/>
-                <w:sz w:val="21"/>
-                <w:szCs w:val="21"/>
-              </w:rPr>
-              <w:t>6.执行自动航线飞行，观察飞行状态</w:t>
+              <w:t>第六章：PX4飞控系统架构</w:t>
+            </w:r>
+          </w:p>
+          <w:p>
+            <w:pPr>
+              <w:spacing w:before="60" w:after="60"/>
+              <w:jc w:val="both"/>
+            </w:pPr>
+            <w:r>
+              <w:rPr>
+                <w:rFonts w:ascii="宋体" w:hAnsi="宋体" w:eastAsia="宋体" w:cs="宋体"/>
+                <w:sz w:val="21"/>
+                <w:szCs w:val="21"/>
+              </w:rPr>
+              <w:t>1.从小车到无人机：技术迁移的思考</w:t>
+            </w:r>
+          </w:p>
+          <w:p>
+            <w:pPr>
+              <w:spacing w:before="60" w:after="60"/>
+              <w:jc w:val="both"/>
+            </w:pPr>
+            <w:r>
+              <w:rPr>
+                <w:rFonts w:ascii="宋体" w:hAnsi="宋体" w:eastAsia="宋体" w:cs="宋体"/>
+                <w:sz w:val="21"/>
+                <w:szCs w:val="21"/>
+              </w:rPr>
+              <w:t>2.飞控系统：PX4架构概览（传感器→估计器→控制器→混控器）</w:t>
+            </w:r>
+          </w:p>
+          <w:p>
+            <w:pPr>
+              <w:spacing w:before="60" w:after="60"/>
+              <w:jc w:val="both"/>
+            </w:pPr>
+            <w:r>
+              <w:rPr>
+                <w:rFonts w:ascii="宋体" w:hAnsi="宋体" w:eastAsia="宋体" w:cs="宋体"/>
+                <w:sz w:val="21"/>
+                <w:szCs w:val="21"/>
+              </w:rPr>
+              <w:t>3.软件分工：PX4（飞控/姿态稳定）与ROS2（任务/业务逻辑）</w:t>
+            </w:r>
+          </w:p>
+          <w:p>
+            <w:pPr>
+              <w:spacing w:before="60" w:after="60"/>
+              <w:jc w:val="both"/>
+            </w:pPr>
+            <w:r>
+              <w:rPr>
+                <w:rFonts w:ascii="宋体" w:hAnsi="宋体" w:eastAsia="宋体" w:cs="宋体"/>
+                <w:sz w:val="21"/>
+                <w:szCs w:val="21"/>
+              </w:rPr>
+              <w:t>4.通信桥接：MicroXRCE-DDS中间件原理</w:t>
+            </w:r>
+          </w:p>
+          <w:p>
+            <w:pPr>
+              <w:spacing w:before="60" w:after="60"/>
+              <w:jc w:val="both"/>
+            </w:pPr>
+            <w:r>
+              <w:rPr>
+                <w:rFonts w:ascii="宋体" w:hAnsi="宋体" w:eastAsia="宋体" w:cs="宋体"/>
+                <w:sz w:val="21"/>
+                <w:szCs w:val="21"/>
+              </w:rPr>
+              <w:t>5.编译并启动PX4 SITL仿真（Gazebo Harmonic）</w:t>
+            </w:r>
+          </w:p>
+          <w:p>
+            <w:pPr>
+              <w:spacing w:before="60" w:after="60"/>
+              <w:jc w:val="both"/>
+            </w:pPr>
+            <w:r>
+              <w:rPr>
+                <w:rFonts w:ascii="宋体" w:hAnsi="宋体" w:eastAsia="宋体" w:cs="宋体"/>
+                <w:sz w:val="21"/>
+                <w:szCs w:val="21"/>
+              </w:rPr>
+              <w:t>6.配置MicroXRCE-DDS Agent，桥接PX4与ROS2</w:t>
+            </w:r>
+          </w:p>
+          <w:p>
+            <w:pPr>
+              <w:spacing w:before="60" w:after="60"/>
+              <w:jc w:val="both"/>
+            </w:pPr>
+            <w:r>
+              <w:rPr>
+                <w:rFonts w:ascii="宋体" w:hAnsi="宋体" w:eastAsia="宋体" w:cs="宋体"/>
+                <w:sz w:val="21"/>
+                <w:szCs w:val="21"/>
+              </w:rPr>
+              <w:t>7.使用 ros2 topic list 查看PX4发布的话题</w:t>
             </w:r>
           </w:p>
           <w:p>
@@ -2805,8 +2803,10 @@
                 <w:sz w:val="21"/>
                 <w:szCs w:val="21"/>
               </w:rPr>
-              <w:t>7.使用地面站进行参数调整与日志下载</w:t>
-            </w:r>
+              <w:t>8.通过ROS2话题读取无人机位姿、速度等状态信息</w:t>
+            </w:r>
+            <w:bookmarkStart w:id="1" w:name="_GoBack"/>
+            <w:bookmarkEnd w:id="1"/>
           </w:p>
         </w:tc>
         <w:tc>

</xml_diff>